<commit_message>
Auto Update Vercel Bot
</commit_message>
<xml_diff>
--- a/knowledge/土地複丈QA.docx
+++ b/knowledge/土地複丈QA.docx
@@ -42,8 +42,6 @@
         </w:rPr>
         <w:t>Q&amp;A</w:t>
       </w:r>
-      <w:bookmarkStart w:id="0" w:name="_GoBack"/>
-      <w:bookmarkEnd w:id="0"/>
     </w:p>
     <w:p>
       <w:pPr>
@@ -51,17 +49,6 @@
         <w:shd w:val="clear" w:color="auto" w:fill="FFFFFF"/>
         <w:spacing w:line="360" w:lineRule="atLeast"/>
         <w:rPr>
-          <w:rFonts w:ascii="Microsoft JhengHei UI" w:eastAsia="Microsoft JhengHei UI" w:hAnsi="Microsoft JhengHei UI" w:cs="新細明體" w:hint="eastAsia"/>
-          <w:b/>
-          <w:bCs/>
-          <w:color w:val="444444"/>
-          <w:kern w:val="0"/>
-          <w:sz w:val="41"/>
-          <w:szCs w:val="41"/>
-        </w:rPr>
-      </w:pPr>
-      <w:r>
-        <w:rPr>
           <w:rFonts w:ascii="Microsoft JhengHei UI" w:eastAsia="Microsoft JhengHei UI" w:hAnsi="Microsoft JhengHei UI" w:cs="新細明體"/>
           <w:b/>
           <w:bCs/>
@@ -70,9 +57,150 @@
           <w:sz w:val="41"/>
           <w:szCs w:val="41"/>
         </w:rPr>
-        <w:fldChar w:fldCharType="begin"/>
-      </w:r>
-      <w:r>
+      </w:pPr>
+      <w:hyperlink r:id="rId4" w:anchor="##" w:tooltip="土地複丈費及建築改良物測量費收費標準新制何時開始實施？" w:history="1">
+        <w:r>
+          <w:rPr>
+            <w:rFonts w:ascii="Microsoft JhengHei UI" w:eastAsia="Microsoft JhengHei UI" w:hAnsi="Microsoft JhengHei UI" w:cs="新細明體" w:hint="eastAsia"/>
+            <w:b/>
+            <w:bCs/>
+            <w:color w:val="367F98"/>
+            <w:kern w:val="0"/>
+            <w:sz w:val="41"/>
+            <w:szCs w:val="41"/>
+            <w:u w:val="single"/>
+          </w:rPr>
+          <w:t>1.土地</w:t>
+        </w:r>
+        <w:proofErr w:type="gramStart"/>
+        <w:r>
+          <w:rPr>
+            <w:rFonts w:ascii="Microsoft JhengHei UI" w:eastAsia="Microsoft JhengHei UI" w:hAnsi="Microsoft JhengHei UI" w:cs="新細明體" w:hint="eastAsia"/>
+            <w:b/>
+            <w:bCs/>
+            <w:color w:val="367F98"/>
+            <w:kern w:val="0"/>
+            <w:sz w:val="41"/>
+            <w:szCs w:val="41"/>
+            <w:u w:val="single"/>
+          </w:rPr>
+          <w:t>複丈費</w:t>
+        </w:r>
+        <w:proofErr w:type="gramEnd"/>
+        <w:r>
+          <w:rPr>
+            <w:rFonts w:ascii="Microsoft JhengHei UI" w:eastAsia="Microsoft JhengHei UI" w:hAnsi="Microsoft JhengHei UI" w:cs="新細明體" w:hint="eastAsia"/>
+            <w:b/>
+            <w:bCs/>
+            <w:color w:val="367F98"/>
+            <w:kern w:val="0"/>
+            <w:sz w:val="41"/>
+            <w:szCs w:val="41"/>
+            <w:u w:val="single"/>
+          </w:rPr>
+          <w:t>及建築改良物測量費收費標準新制何時開始實施？</w:t>
+        </w:r>
+      </w:hyperlink>
+    </w:p>
+    <w:p>
+      <w:pPr>
+        <w:widowControl/>
+        <w:shd w:val="clear" w:color="auto" w:fill="FFFFFF"/>
+        <w:spacing w:after="450"/>
+        <w:rPr>
+          <w:rFonts w:ascii="Microsoft JhengHei UI" w:eastAsia="Microsoft JhengHei UI" w:hAnsi="Microsoft JhengHei UI" w:cs="新細明體"/>
+          <w:color w:val="555555"/>
+          <w:kern w:val="0"/>
+          <w:sz w:val="36"/>
+          <w:szCs w:val="36"/>
+        </w:rPr>
+      </w:pPr>
+      <w:r>
+        <w:rPr>
+          <w:rFonts w:ascii="Verdana" w:eastAsia="Microsoft JhengHei UI" w:hAnsi="Verdana" w:cs="Times New Roman" w:hint="eastAsia"/>
+          <w:color w:val="000000"/>
+          <w:kern w:val="0"/>
+          <w:sz w:val="28"/>
+          <w:szCs w:val="28"/>
+        </w:rPr>
+        <w:t>A</w:t>
+      </w:r>
+      <w:r>
+        <w:rPr>
+          <w:rFonts w:ascii="Verdana" w:eastAsia="Microsoft JhengHei UI" w:hAnsi="Verdana" w:cs="新細明體" w:hint="eastAsia"/>
+          <w:color w:val="000000"/>
+          <w:kern w:val="0"/>
+          <w:sz w:val="28"/>
+          <w:szCs w:val="28"/>
+        </w:rPr>
+        <w:t>：</w:t>
+      </w:r>
+      <w:r>
+        <w:rPr>
+          <w:rFonts w:ascii="Verdana" w:eastAsia="Microsoft JhengHei UI" w:hAnsi="Verdana" w:cs="Times New Roman" w:hint="eastAsia"/>
+          <w:color w:val="000000"/>
+          <w:kern w:val="0"/>
+          <w:sz w:val="28"/>
+          <w:szCs w:val="28"/>
+        </w:rPr>
+        <w:t>112</w:t>
+      </w:r>
+      <w:r>
+        <w:rPr>
+          <w:rFonts w:ascii="Verdana" w:eastAsia="Microsoft JhengHei UI" w:hAnsi="Verdana" w:cs="新細明體" w:hint="eastAsia"/>
+          <w:color w:val="000000"/>
+          <w:kern w:val="0"/>
+          <w:sz w:val="28"/>
+          <w:szCs w:val="28"/>
+        </w:rPr>
+        <w:t>年</w:t>
+      </w:r>
+      <w:r>
+        <w:rPr>
+          <w:rFonts w:ascii="Verdana" w:eastAsia="Microsoft JhengHei UI" w:hAnsi="Verdana" w:cs="Times New Roman" w:hint="eastAsia"/>
+          <w:color w:val="000000"/>
+          <w:kern w:val="0"/>
+          <w:sz w:val="28"/>
+          <w:szCs w:val="28"/>
+        </w:rPr>
+        <w:t>5</w:t>
+      </w:r>
+      <w:r>
+        <w:rPr>
+          <w:rFonts w:ascii="Verdana" w:eastAsia="Microsoft JhengHei UI" w:hAnsi="Verdana" w:cs="新細明體" w:hint="eastAsia"/>
+          <w:color w:val="000000"/>
+          <w:kern w:val="0"/>
+          <w:sz w:val="28"/>
+          <w:szCs w:val="28"/>
+        </w:rPr>
+        <w:t>月</w:t>
+      </w:r>
+      <w:r>
+        <w:rPr>
+          <w:rFonts w:ascii="Verdana" w:eastAsia="Microsoft JhengHei UI" w:hAnsi="Verdana" w:cs="Times New Roman" w:hint="eastAsia"/>
+          <w:color w:val="000000"/>
+          <w:kern w:val="0"/>
+          <w:sz w:val="28"/>
+          <w:szCs w:val="28"/>
+        </w:rPr>
+        <w:t>1</w:t>
+      </w:r>
+      <w:r>
+        <w:rPr>
+          <w:rFonts w:ascii="Verdana" w:eastAsia="Microsoft JhengHei UI" w:hAnsi="Verdana" w:cs="新細明體" w:hint="eastAsia"/>
+          <w:color w:val="000000"/>
+          <w:kern w:val="0"/>
+          <w:sz w:val="28"/>
+          <w:szCs w:val="28"/>
+        </w:rPr>
+        <w:t>日開始實施。</w:t>
+      </w:r>
+    </w:p>
+    <w:p>
+      <w:pPr>
+        <w:widowControl/>
+        <w:shd w:val="clear" w:color="auto" w:fill="FFFFFF"/>
+        <w:spacing w:line="360" w:lineRule="atLeast"/>
         <w:rPr>
           <w:rFonts w:ascii="Microsoft JhengHei UI" w:eastAsia="Microsoft JhengHei UI" w:hAnsi="Microsoft JhengHei UI" w:cs="新細明體"/>
           <w:b/>
@@ -82,184 +210,8 @@
           <w:sz w:val="41"/>
           <w:szCs w:val="41"/>
         </w:rPr>
-        <w:instrText xml:space="preserve"> HYPERLINK "https://sinhu.land.hsinchu.gov.tw/content/?parent_id=10402&amp;type_id=10402" \l "##" \o "土地複丈費及建築改良物測量費收費標準新制何時開始實施？" </w:instrText>
-      </w:r>
-      <w:r>
-        <w:rPr>
-          <w:rFonts w:ascii="Microsoft JhengHei UI" w:eastAsia="Microsoft JhengHei UI" w:hAnsi="Microsoft JhengHei UI" w:cs="新細明體"/>
-          <w:b/>
-          <w:bCs/>
-          <w:color w:val="444444"/>
-          <w:kern w:val="0"/>
-          <w:sz w:val="41"/>
-          <w:szCs w:val="41"/>
-        </w:rPr>
-        <w:fldChar w:fldCharType="separate"/>
-      </w:r>
-      <w:r>
-        <w:rPr>
-          <w:rFonts w:ascii="Microsoft JhengHei UI" w:eastAsia="Microsoft JhengHei UI" w:hAnsi="Microsoft JhengHei UI" w:cs="新細明體" w:hint="eastAsia"/>
-          <w:b/>
-          <w:bCs/>
-          <w:color w:val="367F98"/>
-          <w:kern w:val="0"/>
-          <w:sz w:val="41"/>
-          <w:szCs w:val="41"/>
-          <w:u w:val="single"/>
-        </w:rPr>
-        <w:t>1.土地</w:t>
-      </w:r>
-      <w:proofErr w:type="gramStart"/>
-      <w:r>
-        <w:rPr>
-          <w:rFonts w:ascii="Microsoft JhengHei UI" w:eastAsia="Microsoft JhengHei UI" w:hAnsi="Microsoft JhengHei UI" w:cs="新細明體" w:hint="eastAsia"/>
-          <w:b/>
-          <w:bCs/>
-          <w:color w:val="367F98"/>
-          <w:kern w:val="0"/>
-          <w:sz w:val="41"/>
-          <w:szCs w:val="41"/>
-          <w:u w:val="single"/>
-        </w:rPr>
-        <w:t>複丈費</w:t>
-      </w:r>
-      <w:proofErr w:type="gramEnd"/>
-      <w:r>
-        <w:rPr>
-          <w:rFonts w:ascii="Microsoft JhengHei UI" w:eastAsia="Microsoft JhengHei UI" w:hAnsi="Microsoft JhengHei UI" w:cs="新細明體" w:hint="eastAsia"/>
-          <w:b/>
-          <w:bCs/>
-          <w:color w:val="367F98"/>
-          <w:kern w:val="0"/>
-          <w:sz w:val="41"/>
-          <w:szCs w:val="41"/>
-          <w:u w:val="single"/>
-        </w:rPr>
-        <w:t>及建築改良物測量費收費標準新制何時開始實施？</w:t>
-      </w:r>
-      <w:r>
-        <w:rPr>
-          <w:rFonts w:ascii="Microsoft JhengHei UI" w:eastAsia="Microsoft JhengHei UI" w:hAnsi="Microsoft JhengHei UI" w:cs="新細明體"/>
-          <w:b/>
-          <w:bCs/>
-          <w:color w:val="444444"/>
-          <w:kern w:val="0"/>
-          <w:sz w:val="41"/>
-          <w:szCs w:val="41"/>
-        </w:rPr>
-        <w:fldChar w:fldCharType="end"/>
-      </w:r>
-    </w:p>
-    <w:p>
-      <w:pPr>
-        <w:widowControl/>
-        <w:shd w:val="clear" w:color="auto" w:fill="FFFFFF"/>
-        <w:spacing w:after="450"/>
-        <w:rPr>
-          <w:rFonts w:ascii="Microsoft JhengHei UI" w:eastAsia="Microsoft JhengHei UI" w:hAnsi="Microsoft JhengHei UI" w:cs="新細明體" w:hint="eastAsia"/>
-          <w:color w:val="555555"/>
-          <w:kern w:val="0"/>
-          <w:sz w:val="36"/>
-          <w:szCs w:val="36"/>
-        </w:rPr>
       </w:pPr>
-      <w:r>
-        <w:rPr>
-          <w:rFonts w:ascii="Verdana" w:eastAsia="Microsoft JhengHei UI" w:hAnsi="Verdana" w:cs="Times New Roman" w:hint="eastAsia"/>
-          <w:color w:val="000000"/>
-          <w:kern w:val="0"/>
-          <w:sz w:val="28"/>
-          <w:szCs w:val="28"/>
-        </w:rPr>
-        <w:t>A</w:t>
-      </w:r>
-      <w:r>
-        <w:rPr>
-          <w:rFonts w:ascii="Verdana" w:eastAsia="Microsoft JhengHei UI" w:hAnsi="Verdana" w:cs="新細明體" w:hint="eastAsia"/>
-          <w:color w:val="000000"/>
-          <w:kern w:val="0"/>
-          <w:sz w:val="28"/>
-          <w:szCs w:val="28"/>
-        </w:rPr>
-        <w:t>：</w:t>
-      </w:r>
-      <w:r>
-        <w:rPr>
-          <w:rFonts w:ascii="Verdana" w:eastAsia="Microsoft JhengHei UI" w:hAnsi="Verdana" w:cs="Times New Roman" w:hint="eastAsia"/>
-          <w:color w:val="000000"/>
-          <w:kern w:val="0"/>
-          <w:sz w:val="28"/>
-          <w:szCs w:val="28"/>
-        </w:rPr>
-        <w:t>112</w:t>
-      </w:r>
-      <w:r>
-        <w:rPr>
-          <w:rFonts w:ascii="Verdana" w:eastAsia="Microsoft JhengHei UI" w:hAnsi="Verdana" w:cs="新細明體" w:hint="eastAsia"/>
-          <w:color w:val="000000"/>
-          <w:kern w:val="0"/>
-          <w:sz w:val="28"/>
-          <w:szCs w:val="28"/>
-        </w:rPr>
-        <w:t>年</w:t>
-      </w:r>
-      <w:r>
-        <w:rPr>
-          <w:rFonts w:ascii="Verdana" w:eastAsia="Microsoft JhengHei UI" w:hAnsi="Verdana" w:cs="Times New Roman" w:hint="eastAsia"/>
-          <w:color w:val="000000"/>
-          <w:kern w:val="0"/>
-          <w:sz w:val="28"/>
-          <w:szCs w:val="28"/>
-        </w:rPr>
-        <w:t>5</w:t>
-      </w:r>
-      <w:r>
-        <w:rPr>
-          <w:rFonts w:ascii="Verdana" w:eastAsia="Microsoft JhengHei UI" w:hAnsi="Verdana" w:cs="新細明體" w:hint="eastAsia"/>
-          <w:color w:val="000000"/>
-          <w:kern w:val="0"/>
-          <w:sz w:val="28"/>
-          <w:szCs w:val="28"/>
-        </w:rPr>
-        <w:t>月</w:t>
-      </w:r>
-      <w:r>
-        <w:rPr>
-          <w:rFonts w:ascii="Verdana" w:eastAsia="Microsoft JhengHei UI" w:hAnsi="Verdana" w:cs="Times New Roman" w:hint="eastAsia"/>
-          <w:color w:val="000000"/>
-          <w:kern w:val="0"/>
-          <w:sz w:val="28"/>
-          <w:szCs w:val="28"/>
-        </w:rPr>
-        <w:t>1</w:t>
-      </w:r>
-      <w:r>
-        <w:rPr>
-          <w:rFonts w:ascii="Verdana" w:eastAsia="Microsoft JhengHei UI" w:hAnsi="Verdana" w:cs="新細明體" w:hint="eastAsia"/>
-          <w:color w:val="000000"/>
-          <w:kern w:val="0"/>
-          <w:sz w:val="28"/>
-          <w:szCs w:val="28"/>
-        </w:rPr>
-        <w:t>日開始實施。</w:t>
-      </w:r>
-    </w:p>
-    <w:p>
-      <w:pPr>
-        <w:widowControl/>
-        <w:shd w:val="clear" w:color="auto" w:fill="FFFFFF"/>
-        <w:spacing w:line="360" w:lineRule="atLeast"/>
-        <w:rPr>
-          <w:rFonts w:ascii="Microsoft JhengHei UI" w:eastAsia="Microsoft JhengHei UI" w:hAnsi="Microsoft JhengHei UI" w:cs="新細明體" w:hint="eastAsia"/>
-          <w:b/>
-          <w:bCs/>
-          <w:color w:val="444444"/>
-          <w:kern w:val="0"/>
-          <w:sz w:val="41"/>
-          <w:szCs w:val="41"/>
-        </w:rPr>
-      </w:pPr>
-      <w:hyperlink r:id="rId4" w:anchor="##" w:tooltip="申請鑑界是否需自備制式界標？" w:history="1">
+      <w:hyperlink r:id="rId5" w:anchor="##" w:tooltip="申請鑑界是否需自備制式界標？" w:history="1">
         <w:r>
           <w:rPr>
             <w:rFonts w:ascii="Microsoft JhengHei UI" w:eastAsia="Microsoft JhengHei UI" w:hAnsi="Microsoft JhengHei UI" w:cs="新細明體" w:hint="eastAsia"/>
@@ -281,7 +233,7 @@
         <w:shd w:val="clear" w:color="auto" w:fill="FFFFFF"/>
         <w:spacing w:after="450"/>
         <w:rPr>
-          <w:rFonts w:ascii="Microsoft JhengHei UI" w:eastAsia="Microsoft JhengHei UI" w:hAnsi="Microsoft JhengHei UI" w:cs="新細明體" w:hint="eastAsia"/>
+          <w:rFonts w:ascii="Microsoft JhengHei UI" w:eastAsia="Microsoft JhengHei UI" w:hAnsi="Microsoft JhengHei UI" w:cs="新細明體"/>
           <w:color w:val="555555"/>
           <w:kern w:val="0"/>
           <w:sz w:val="36"/>
@@ -403,7 +355,7 @@
         <w:shd w:val="clear" w:color="auto" w:fill="FFFFFF"/>
         <w:spacing w:line="360" w:lineRule="atLeast"/>
         <w:rPr>
-          <w:rFonts w:ascii="Microsoft JhengHei UI" w:eastAsia="Microsoft JhengHei UI" w:hAnsi="Microsoft JhengHei UI" w:cs="新細明體" w:hint="eastAsia"/>
+          <w:rFonts w:ascii="Microsoft JhengHei UI" w:eastAsia="Microsoft JhengHei UI" w:hAnsi="Microsoft JhengHei UI" w:cs="新細明體"/>
           <w:b/>
           <w:bCs/>
           <w:color w:val="444444"/>
@@ -412,7 +364,7 @@
           <w:szCs w:val="41"/>
         </w:rPr>
       </w:pPr>
-      <w:hyperlink r:id="rId5" w:anchor="##" w:tooltip="新制施行後，該如何計算申請鑑界的規費？" w:history="1">
+      <w:hyperlink r:id="rId6" w:anchor="##" w:tooltip="新制施行後，該如何計算申請鑑界的規費？" w:history="1">
         <w:r>
           <w:rPr>
             <w:rFonts w:ascii="Microsoft JhengHei UI" w:eastAsia="Microsoft JhengHei UI" w:hAnsi="Microsoft JhengHei UI" w:cs="新細明體" w:hint="eastAsia"/>
@@ -462,7 +414,7 @@
         <w:shd w:val="clear" w:color="auto" w:fill="FFFFFF"/>
         <w:spacing w:after="450"/>
         <w:rPr>
-          <w:rFonts w:ascii="Microsoft JhengHei UI" w:eastAsia="Microsoft JhengHei UI" w:hAnsi="Microsoft JhengHei UI" w:cs="新細明體" w:hint="eastAsia"/>
+          <w:rFonts w:ascii="Microsoft JhengHei UI" w:eastAsia="Microsoft JhengHei UI" w:hAnsi="Microsoft JhengHei UI" w:cs="新細明體"/>
           <w:color w:val="555555"/>
           <w:kern w:val="0"/>
           <w:sz w:val="36"/>
@@ -540,7 +492,7 @@
         <w:shd w:val="clear" w:color="auto" w:fill="FFFFFF"/>
         <w:spacing w:line="360" w:lineRule="atLeast"/>
         <w:rPr>
-          <w:rFonts w:ascii="Microsoft JhengHei UI" w:eastAsia="Microsoft JhengHei UI" w:hAnsi="Microsoft JhengHei UI" w:cs="新細明體" w:hint="eastAsia"/>
+          <w:rFonts w:ascii="Microsoft JhengHei UI" w:eastAsia="Microsoft JhengHei UI" w:hAnsi="Microsoft JhengHei UI" w:cs="新細明體"/>
           <w:b/>
           <w:bCs/>
           <w:color w:val="444444"/>
@@ -549,7 +501,7 @@
           <w:szCs w:val="41"/>
         </w:rPr>
       </w:pPr>
-      <w:hyperlink r:id="rId6" w:anchor="##" w:tooltip="想大概了解土地位置，不需釘定界標及土地複丈成果圖，可以用什麼方式呢？" w:history="1">
+      <w:hyperlink r:id="rId7" w:anchor="##" w:tooltip="想大概了解土地位置，不需釘定界標及土地複丈成果圖，可以用什麼方式呢？" w:history="1">
         <w:r>
           <w:rPr>
             <w:rFonts w:ascii="Microsoft JhengHei UI" w:eastAsia="Microsoft JhengHei UI" w:hAnsi="Microsoft JhengHei UI" w:cs="新細明體" w:hint="eastAsia"/>
@@ -627,7 +579,7 @@
         <w:shd w:val="clear" w:color="auto" w:fill="FFFFFF"/>
         <w:spacing w:after="450"/>
         <w:rPr>
-          <w:rFonts w:ascii="Microsoft JhengHei UI" w:eastAsia="Microsoft JhengHei UI" w:hAnsi="Microsoft JhengHei UI" w:cs="新細明體" w:hint="eastAsia"/>
+          <w:rFonts w:ascii="Microsoft JhengHei UI" w:eastAsia="Microsoft JhengHei UI" w:hAnsi="Microsoft JhengHei UI" w:cs="新細明體"/>
           <w:color w:val="555555"/>
           <w:kern w:val="0"/>
           <w:sz w:val="36"/>
@@ -661,7 +613,7 @@
         <w:shd w:val="clear" w:color="auto" w:fill="FFFFFF"/>
         <w:spacing w:line="360" w:lineRule="atLeast"/>
         <w:rPr>
-          <w:rFonts w:ascii="Microsoft JhengHei UI" w:eastAsia="Microsoft JhengHei UI" w:hAnsi="Microsoft JhengHei UI" w:cs="新細明體" w:hint="eastAsia"/>
+          <w:rFonts w:ascii="Microsoft JhengHei UI" w:eastAsia="Microsoft JhengHei UI" w:hAnsi="Microsoft JhengHei UI" w:cs="新細明體"/>
           <w:b/>
           <w:bCs/>
           <w:color w:val="444444"/>
@@ -670,7 +622,7 @@
           <w:szCs w:val="41"/>
         </w:rPr>
       </w:pPr>
-      <w:hyperlink r:id="rId7" w:anchor="##" w:tooltip="位置勘查費用如何計算？" w:history="1">
+      <w:hyperlink r:id="rId8" w:anchor="##" w:tooltip="位置勘查費用如何計算？" w:history="1">
         <w:r>
           <w:rPr>
             <w:rFonts w:ascii="Microsoft JhengHei UI" w:eastAsia="Microsoft JhengHei UI" w:hAnsi="Microsoft JhengHei UI" w:cs="新細明體" w:hint="eastAsia"/>
@@ -692,7 +644,7 @@
         <w:shd w:val="clear" w:color="auto" w:fill="FFFFFF"/>
         <w:spacing w:after="450"/>
         <w:rPr>
-          <w:rFonts w:ascii="Microsoft JhengHei UI" w:eastAsia="Microsoft JhengHei UI" w:hAnsi="Microsoft JhengHei UI" w:cs="新細明體" w:hint="eastAsia"/>
+          <w:rFonts w:ascii="Microsoft JhengHei UI" w:eastAsia="Microsoft JhengHei UI" w:hAnsi="Microsoft JhengHei UI" w:cs="新細明體"/>
           <w:color w:val="555555"/>
           <w:kern w:val="0"/>
           <w:sz w:val="36"/>
@@ -746,7 +698,7 @@
         <w:shd w:val="clear" w:color="auto" w:fill="FFFFFF"/>
         <w:spacing w:line="360" w:lineRule="atLeast"/>
         <w:rPr>
-          <w:rFonts w:ascii="Microsoft JhengHei UI" w:eastAsia="Microsoft JhengHei UI" w:hAnsi="Microsoft JhengHei UI" w:cs="新細明體" w:hint="eastAsia"/>
+          <w:rFonts w:ascii="Microsoft JhengHei UI" w:eastAsia="Microsoft JhengHei UI" w:hAnsi="Microsoft JhengHei UI" w:cs="新細明體"/>
           <w:b/>
           <w:bCs/>
           <w:color w:val="444444"/>
@@ -755,7 +707,7 @@
           <w:szCs w:val="41"/>
         </w:rPr>
       </w:pPr>
-      <w:hyperlink r:id="rId8" w:anchor="##" w:tooltip="土地複丈費及建築改良物測量費收費標準修正實施後，土地鑑界費用如何計算？" w:history="1">
+      <w:hyperlink r:id="rId9" w:anchor="##" w:tooltip="土地複丈費及建築改良物測量費收費標準修正實施後，土地鑑界費用如何計算？" w:history="1">
         <w:r>
           <w:rPr>
             <w:rFonts w:ascii="Microsoft JhengHei UI" w:eastAsia="Microsoft JhengHei UI" w:hAnsi="Microsoft JhengHei UI" w:cs="新細明體" w:hint="eastAsia"/>
@@ -833,7 +785,7 @@
         <w:shd w:val="clear" w:color="auto" w:fill="FFFFFF"/>
         <w:spacing w:after="450"/>
         <w:rPr>
-          <w:rFonts w:ascii="Microsoft JhengHei UI" w:eastAsia="Microsoft JhengHei UI" w:hAnsi="Microsoft JhengHei UI" w:cs="新細明體" w:hint="eastAsia"/>
+          <w:rFonts w:ascii="Microsoft JhengHei UI" w:eastAsia="Microsoft JhengHei UI" w:hAnsi="Microsoft JhengHei UI" w:cs="新細明體"/>
           <w:color w:val="555555"/>
           <w:kern w:val="0"/>
           <w:sz w:val="36"/>
@@ -1267,7 +1219,7 @@
         <w:shd w:val="clear" w:color="auto" w:fill="FFFFFF"/>
         <w:spacing w:line="360" w:lineRule="atLeast"/>
         <w:rPr>
-          <w:rFonts w:ascii="Microsoft JhengHei UI" w:eastAsia="Microsoft JhengHei UI" w:hAnsi="Microsoft JhengHei UI" w:cs="新細明體" w:hint="eastAsia"/>
+          <w:rFonts w:ascii="Microsoft JhengHei UI" w:eastAsia="Microsoft JhengHei UI" w:hAnsi="Microsoft JhengHei UI" w:cs="新細明體"/>
           <w:b/>
           <w:bCs/>
           <w:color w:val="444444"/>
@@ -1276,7 +1228,7 @@
           <w:szCs w:val="41"/>
         </w:rPr>
       </w:pPr>
-      <w:hyperlink r:id="rId9" w:anchor="##" w:tooltip="辦理土地分割費用如何計算？" w:history="1">
+      <w:hyperlink r:id="rId10" w:anchor="##" w:tooltip="辦理土地分割費用如何計算？" w:history="1">
         <w:r>
           <w:rPr>
             <w:rFonts w:ascii="Microsoft JhengHei UI" w:eastAsia="Microsoft JhengHei UI" w:hAnsi="Microsoft JhengHei UI" w:cs="新細明體" w:hint="eastAsia"/>
@@ -1298,7 +1250,7 @@
         <w:shd w:val="clear" w:color="auto" w:fill="FFFFFF"/>
         <w:spacing w:after="450"/>
         <w:rPr>
-          <w:rFonts w:ascii="Microsoft JhengHei UI" w:eastAsia="Microsoft JhengHei UI" w:hAnsi="Microsoft JhengHei UI" w:cs="新細明體" w:hint="eastAsia"/>
+          <w:rFonts w:ascii="Microsoft JhengHei UI" w:eastAsia="Microsoft JhengHei UI" w:hAnsi="Microsoft JhengHei UI" w:cs="新細明體"/>
           <w:color w:val="555555"/>
           <w:kern w:val="0"/>
           <w:sz w:val="36"/>
@@ -1596,7 +1548,7 @@
         <w:shd w:val="clear" w:color="auto" w:fill="FFFFFF"/>
         <w:spacing w:line="360" w:lineRule="atLeast"/>
         <w:rPr>
-          <w:rFonts w:ascii="Microsoft JhengHei UI" w:eastAsia="Microsoft JhengHei UI" w:hAnsi="Microsoft JhengHei UI" w:cs="新細明體" w:hint="eastAsia"/>
+          <w:rFonts w:ascii="Microsoft JhengHei UI" w:eastAsia="Microsoft JhengHei UI" w:hAnsi="Microsoft JhengHei UI" w:cs="新細明體"/>
           <w:b/>
           <w:bCs/>
           <w:color w:val="444444"/>
@@ -1605,7 +1557,7 @@
           <w:szCs w:val="41"/>
         </w:rPr>
       </w:pPr>
-      <w:hyperlink r:id="rId10" w:anchor="##" w:tooltip="申請界址調整有限制嗎？" w:history="1">
+      <w:hyperlink r:id="rId11" w:anchor="##" w:tooltip="申請界址調整有限制嗎？" w:history="1">
         <w:r>
           <w:rPr>
             <w:rFonts w:ascii="Microsoft JhengHei UI" w:eastAsia="Microsoft JhengHei UI" w:hAnsi="Microsoft JhengHei UI" w:cs="新細明體" w:hint="eastAsia"/>
@@ -1627,7 +1579,7 @@
         <w:shd w:val="clear" w:color="auto" w:fill="FFFFFF"/>
         <w:spacing w:after="450"/>
         <w:rPr>
-          <w:rFonts w:ascii="Microsoft JhengHei UI" w:eastAsia="Microsoft JhengHei UI" w:hAnsi="Microsoft JhengHei UI" w:cs="新細明體" w:hint="eastAsia"/>
+          <w:rFonts w:ascii="Microsoft JhengHei UI" w:eastAsia="Microsoft JhengHei UI" w:hAnsi="Microsoft JhengHei UI" w:cs="新細明體"/>
           <w:color w:val="555555"/>
           <w:kern w:val="0"/>
           <w:sz w:val="36"/>
@@ -1683,7 +1635,7 @@
         <w:shd w:val="clear" w:color="auto" w:fill="FFFFFF"/>
         <w:spacing w:line="360" w:lineRule="atLeast"/>
         <w:rPr>
-          <w:rFonts w:ascii="Microsoft JhengHei UI" w:eastAsia="Microsoft JhengHei UI" w:hAnsi="Microsoft JhengHei UI" w:cs="新細明體" w:hint="eastAsia"/>
+          <w:rFonts w:ascii="Microsoft JhengHei UI" w:eastAsia="Microsoft JhengHei UI" w:hAnsi="Microsoft JhengHei UI" w:cs="新細明體"/>
           <w:b/>
           <w:bCs/>
           <w:color w:val="444444"/>
@@ -1692,7 +1644,7 @@
           <w:szCs w:val="41"/>
         </w:rPr>
       </w:pPr>
-      <w:hyperlink r:id="rId11" w:anchor="##" w:tooltip="若我只需要測量4個界址點位，可以申請退還施測費嗎？" w:history="1">
+      <w:hyperlink r:id="rId12" w:anchor="##" w:tooltip="若我只需要測量4個界址點位，可以申請退還施測費嗎？" w:history="1">
         <w:r>
           <w:rPr>
             <w:rFonts w:ascii="Microsoft JhengHei UI" w:eastAsia="Microsoft JhengHei UI" w:hAnsi="Microsoft JhengHei UI" w:cs="新細明體" w:hint="eastAsia"/>
@@ -1770,7 +1722,7 @@
         <w:shd w:val="clear" w:color="auto" w:fill="FFFFFF"/>
         <w:spacing w:after="450"/>
         <w:rPr>
-          <w:rFonts w:ascii="Microsoft JhengHei UI" w:eastAsia="Microsoft JhengHei UI" w:hAnsi="Microsoft JhengHei UI" w:cs="新細明體" w:hint="eastAsia"/>
+          <w:rFonts w:ascii="Microsoft JhengHei UI" w:eastAsia="Microsoft JhengHei UI" w:hAnsi="Microsoft JhengHei UI" w:cs="新細明體"/>
           <w:color w:val="555555"/>
           <w:kern w:val="0"/>
           <w:sz w:val="36"/>
@@ -1886,7 +1838,7 @@
         <w:shd w:val="clear" w:color="auto" w:fill="FFFFFF"/>
         <w:spacing w:line="360" w:lineRule="atLeast"/>
         <w:rPr>
-          <w:rFonts w:ascii="Microsoft JhengHei UI" w:eastAsia="Microsoft JhengHei UI" w:hAnsi="Microsoft JhengHei UI" w:cs="新細明體" w:hint="eastAsia"/>
+          <w:rFonts w:ascii="Microsoft JhengHei UI" w:eastAsia="Microsoft JhengHei UI" w:hAnsi="Microsoft JhengHei UI" w:cs="新細明體"/>
           <w:b/>
           <w:bCs/>
           <w:color w:val="444444"/>
@@ -1895,7 +1847,7 @@
           <w:szCs w:val="41"/>
         </w:rPr>
       </w:pPr>
-      <w:hyperlink r:id="rId12" w:anchor="##" w:tooltip="可以於現場需要增加施測界址點嗎？" w:history="1">
+      <w:hyperlink r:id="rId13" w:anchor="##" w:tooltip="可以於現場需要增加施測界址點嗎？" w:history="1">
         <w:r>
           <w:rPr>
             <w:rFonts w:ascii="Microsoft JhengHei UI" w:eastAsia="Microsoft JhengHei UI" w:hAnsi="Microsoft JhengHei UI" w:cs="新細明體" w:hint="eastAsia"/>
@@ -1945,99 +1897,1041 @@
         <w:shd w:val="clear" w:color="auto" w:fill="FFFFFF"/>
         <w:spacing w:after="450"/>
         <w:rPr>
+          <w:rFonts w:ascii="Verdana" w:eastAsia="Microsoft JhengHei UI" w:hAnsi="Verdana" w:cs="新細明體"/>
+          <w:color w:val="555555"/>
+          <w:kern w:val="0"/>
+          <w:sz w:val="28"/>
+          <w:szCs w:val="28"/>
+        </w:rPr>
+      </w:pPr>
+      <w:r>
+        <w:rPr>
+          <w:rFonts w:ascii="Verdana" w:eastAsia="Microsoft JhengHei UI" w:hAnsi="Verdana" w:cs="Times New Roman" w:hint="eastAsia"/>
+          <w:color w:val="555555"/>
+          <w:kern w:val="0"/>
+          <w:sz w:val="28"/>
+          <w:szCs w:val="28"/>
+        </w:rPr>
+        <w:t>A</w:t>
+      </w:r>
+      <w:r>
+        <w:rPr>
+          <w:rFonts w:ascii="Verdana" w:eastAsia="Microsoft JhengHei UI" w:hAnsi="Verdana" w:cs="新細明體" w:hint="eastAsia"/>
+          <w:color w:val="555555"/>
+          <w:kern w:val="0"/>
+          <w:sz w:val="28"/>
+          <w:szCs w:val="28"/>
+        </w:rPr>
+        <w:t>：若增加後施</w:t>
+      </w:r>
+      <w:proofErr w:type="gramStart"/>
+      <w:r>
+        <w:rPr>
+          <w:rFonts w:ascii="Verdana" w:eastAsia="Microsoft JhengHei UI" w:hAnsi="Verdana" w:cs="新細明體" w:hint="eastAsia"/>
+          <w:color w:val="555555"/>
+          <w:kern w:val="0"/>
+          <w:sz w:val="28"/>
+          <w:szCs w:val="28"/>
+        </w:rPr>
+        <w:t>測界址點</w:t>
+      </w:r>
+      <w:proofErr w:type="gramEnd"/>
+      <w:r>
+        <w:rPr>
+          <w:rFonts w:ascii="Verdana" w:eastAsia="Microsoft JhengHei UI" w:hAnsi="Verdana" w:cs="新細明體" w:hint="eastAsia"/>
+          <w:color w:val="555555"/>
+          <w:kern w:val="0"/>
+          <w:sz w:val="28"/>
+          <w:szCs w:val="28"/>
+        </w:rPr>
+        <w:t>的數量未超出原申請施測單位，且相關鄰地人有到場，可於現場直接施測，倘超出原申請施測單位或有未事先通知之鄰地關係人，則需依地籍測量實施規則第</w:t>
+      </w:r>
+      <w:r>
+        <w:rPr>
+          <w:rFonts w:ascii="Verdana" w:eastAsia="Microsoft JhengHei UI" w:hAnsi="Verdana" w:cs="Times New Roman" w:hint="eastAsia"/>
+          <w:color w:val="555555"/>
+          <w:kern w:val="0"/>
+          <w:sz w:val="28"/>
+          <w:szCs w:val="28"/>
+        </w:rPr>
+        <w:t>212</w:t>
+      </w:r>
+      <w:r>
+        <w:rPr>
+          <w:rFonts w:ascii="Verdana" w:eastAsia="Microsoft JhengHei UI" w:hAnsi="Verdana" w:cs="新細明體" w:hint="eastAsia"/>
+          <w:color w:val="555555"/>
+          <w:kern w:val="0"/>
+          <w:sz w:val="28"/>
+          <w:szCs w:val="28"/>
+        </w:rPr>
+        <w:t>條規定辦理補正，修改土地</w:t>
+      </w:r>
+      <w:proofErr w:type="gramStart"/>
+      <w:r>
+        <w:rPr>
+          <w:rFonts w:ascii="Verdana" w:eastAsia="Microsoft JhengHei UI" w:hAnsi="Verdana" w:cs="新細明體" w:hint="eastAsia"/>
+          <w:color w:val="555555"/>
+          <w:kern w:val="0"/>
+          <w:sz w:val="28"/>
+          <w:szCs w:val="28"/>
+        </w:rPr>
+        <w:t>複</w:t>
+      </w:r>
+      <w:proofErr w:type="gramEnd"/>
+      <w:r>
+        <w:rPr>
+          <w:rFonts w:ascii="Verdana" w:eastAsia="Microsoft JhengHei UI" w:hAnsi="Verdana" w:cs="新細明體" w:hint="eastAsia"/>
+          <w:color w:val="555555"/>
+          <w:kern w:val="0"/>
+          <w:sz w:val="28"/>
+          <w:szCs w:val="28"/>
+        </w:rPr>
+        <w:t>丈申請書後，另行安排時間測量。</w:t>
+      </w:r>
+    </w:p>
+    <w:p>
+      <w:pPr>
+        <w:widowControl/>
+        <w:shd w:val="clear" w:color="auto" w:fill="FFFFFF"/>
+        <w:spacing w:line="360" w:lineRule="atLeast"/>
+        <w:rPr>
+          <w:rFonts w:ascii="Microsoft JhengHei UI" w:eastAsia="Microsoft JhengHei UI" w:hAnsi="Microsoft JhengHei UI" w:cs="新細明體"/>
+          <w:b/>
+          <w:bCs/>
+          <w:color w:val="444444"/>
+          <w:kern w:val="0"/>
+          <w:sz w:val="41"/>
+          <w:szCs w:val="41"/>
+        </w:rPr>
+      </w:pPr>
+      <w:hyperlink r:id="rId14" w:anchor="##" w:tooltip="可以於現場需要增加施測界址點嗎？" w:history="1">
+        <w:r>
+          <w:rPr>
+            <w:rFonts w:ascii="Microsoft JhengHei UI" w:eastAsia="Microsoft JhengHei UI" w:hAnsi="Microsoft JhengHei UI" w:cs="新細明體" w:hint="eastAsia"/>
+            <w:b/>
+            <w:bCs/>
+            <w:color w:val="367F98"/>
+            <w:kern w:val="0"/>
+            <w:sz w:val="41"/>
+            <w:szCs w:val="41"/>
+            <w:u w:val="single"/>
+          </w:rPr>
+          <w:t>11</w:t>
+        </w:r>
+        <w:r>
+          <w:rPr>
+            <w:rFonts w:ascii="Microsoft JhengHei UI" w:eastAsia="Microsoft JhengHei UI" w:hAnsi="Microsoft JhengHei UI" w:cs="新細明體" w:hint="eastAsia"/>
+            <w:b/>
+            <w:bCs/>
+            <w:color w:val="367F98"/>
+            <w:kern w:val="0"/>
+            <w:sz w:val="41"/>
+            <w:szCs w:val="41"/>
+            <w:u w:val="single"/>
+          </w:rPr>
+          <w:t>.</w:t>
+        </w:r>
+      </w:hyperlink>
+      <w:r>
+        <w:rPr>
           <w:rFonts w:ascii="Microsoft JhengHei UI" w:eastAsia="Microsoft JhengHei UI" w:hAnsi="Microsoft JhengHei UI" w:cs="新細明體" w:hint="eastAsia"/>
-          <w:color w:val="555555"/>
-          <w:kern w:val="0"/>
-          <w:sz w:val="36"/>
-          <w:szCs w:val="36"/>
+          <w:b/>
+          <w:bCs/>
+          <w:color w:val="367F98"/>
+          <w:kern w:val="0"/>
+          <w:sz w:val="41"/>
+          <w:szCs w:val="41"/>
+          <w:u w:val="single"/>
+        </w:rPr>
+        <w:t xml:space="preserve"> </w:t>
+      </w:r>
+      <w:proofErr w:type="gramStart"/>
+      <w:r>
+        <w:rPr>
+          <w:rFonts w:ascii="Microsoft JhengHei UI" w:eastAsia="Microsoft JhengHei UI" w:hAnsi="Microsoft JhengHei UI" w:cs="新細明體" w:hint="eastAsia"/>
+          <w:b/>
+          <w:bCs/>
+          <w:color w:val="367F98"/>
+          <w:kern w:val="0"/>
+          <w:sz w:val="41"/>
+          <w:szCs w:val="41"/>
+          <w:u w:val="single"/>
+        </w:rPr>
+        <w:t>鑑</w:t>
+      </w:r>
+      <w:proofErr w:type="gramEnd"/>
+      <w:r>
+        <w:rPr>
+          <w:rFonts w:ascii="Microsoft JhengHei UI" w:eastAsia="Microsoft JhengHei UI" w:hAnsi="Microsoft JhengHei UI" w:cs="新細明體" w:hint="eastAsia"/>
+          <w:b/>
+          <w:bCs/>
+          <w:color w:val="367F98"/>
+          <w:kern w:val="0"/>
+          <w:sz w:val="41"/>
+          <w:szCs w:val="41"/>
+          <w:u w:val="single"/>
+        </w:rPr>
+        <w:t>界現場需要注意什麼？</w:t>
+      </w:r>
+    </w:p>
+    <w:p>
+      <w:pPr>
+        <w:widowControl/>
+        <w:spacing w:before="100" w:beforeAutospacing="1" w:after="100" w:afterAutospacing="1"/>
+        <w:rPr>
+          <w:rFonts w:ascii="新細明體" w:eastAsia="新細明體" w:hAnsi="新細明體" w:cs="新細明體"/>
+          <w:kern w:val="0"/>
+          <w:szCs w:val="24"/>
         </w:rPr>
       </w:pPr>
       <w:r>
         <w:rPr>
-          <w:rFonts w:ascii="Verdana" w:eastAsia="Microsoft JhengHei UI" w:hAnsi="Verdana" w:cs="Times New Roman" w:hint="eastAsia"/>
-          <w:color w:val="555555"/>
-          <w:kern w:val="0"/>
-          <w:sz w:val="28"/>
-          <w:szCs w:val="28"/>
+          <w:rFonts w:ascii="新細明體" w:eastAsia="新細明體" w:hAnsi="新細明體" w:cs="新細明體"/>
+          <w:kern w:val="0"/>
+          <w:szCs w:val="24"/>
         </w:rPr>
         <w:t>A</w:t>
       </w:r>
       <w:r>
         <w:rPr>
-          <w:rFonts w:ascii="Verdana" w:eastAsia="Microsoft JhengHei UI" w:hAnsi="Verdana" w:cs="新細明體" w:hint="eastAsia"/>
-          <w:color w:val="555555"/>
-          <w:kern w:val="0"/>
-          <w:sz w:val="28"/>
-          <w:szCs w:val="28"/>
-        </w:rPr>
-        <w:t>：若增加後施</w:t>
-      </w:r>
-      <w:proofErr w:type="gramStart"/>
-      <w:r>
-        <w:rPr>
-          <w:rFonts w:ascii="Verdana" w:eastAsia="Microsoft JhengHei UI" w:hAnsi="Verdana" w:cs="新細明體" w:hint="eastAsia"/>
-          <w:color w:val="555555"/>
-          <w:kern w:val="0"/>
-          <w:sz w:val="28"/>
-          <w:szCs w:val="28"/>
-        </w:rPr>
-        <w:t>測界址點</w:t>
-      </w:r>
-      <w:proofErr w:type="gramEnd"/>
-      <w:r>
-        <w:rPr>
-          <w:rFonts w:ascii="Verdana" w:eastAsia="Microsoft JhengHei UI" w:hAnsi="Verdana" w:cs="新細明體" w:hint="eastAsia"/>
-          <w:color w:val="555555"/>
-          <w:kern w:val="0"/>
-          <w:sz w:val="28"/>
-          <w:szCs w:val="28"/>
-        </w:rPr>
-        <w:t>的數量未超出原申請施測單位，且相關鄰地人有到場，可於現場直接施測，倘超出原申請施測單位或有未事先通知之鄰地關係人，則需依地籍測量實施規則第</w:t>
-      </w:r>
-      <w:r>
-        <w:rPr>
-          <w:rFonts w:ascii="Verdana" w:eastAsia="Microsoft JhengHei UI" w:hAnsi="Verdana" w:cs="Times New Roman" w:hint="eastAsia"/>
-          <w:color w:val="555555"/>
-          <w:kern w:val="0"/>
-          <w:sz w:val="28"/>
-          <w:szCs w:val="28"/>
-        </w:rPr>
-        <w:t>212</w:t>
-      </w:r>
-      <w:r>
-        <w:rPr>
-          <w:rFonts w:ascii="Verdana" w:eastAsia="Microsoft JhengHei UI" w:hAnsi="Verdana" w:cs="新細明體" w:hint="eastAsia"/>
-          <w:color w:val="555555"/>
-          <w:kern w:val="0"/>
-          <w:sz w:val="28"/>
-          <w:szCs w:val="28"/>
-        </w:rPr>
-        <w:t>條規定辦理補正，修改土地</w:t>
-      </w:r>
-      <w:proofErr w:type="gramStart"/>
-      <w:r>
-        <w:rPr>
-          <w:rFonts w:ascii="Verdana" w:eastAsia="Microsoft JhengHei UI" w:hAnsi="Verdana" w:cs="新細明體" w:hint="eastAsia"/>
-          <w:color w:val="555555"/>
-          <w:kern w:val="0"/>
-          <w:sz w:val="28"/>
-          <w:szCs w:val="28"/>
+          <w:rFonts w:ascii="新細明體" w:eastAsia="新細明體" w:hAnsi="新細明體" w:cs="新細明體"/>
+          <w:kern w:val="0"/>
+          <w:szCs w:val="24"/>
+        </w:rPr>
+        <w:t>：為確保</w:t>
+      </w:r>
+      <w:proofErr w:type="gramStart"/>
+      <w:r>
+        <w:rPr>
+          <w:rFonts w:ascii="新細明體" w:eastAsia="新細明體" w:hAnsi="新細明體" w:cs="新細明體"/>
+          <w:kern w:val="0"/>
+          <w:szCs w:val="24"/>
+        </w:rPr>
+        <w:t>鑑</w:t>
+      </w:r>
+      <w:proofErr w:type="gramEnd"/>
+      <w:r>
+        <w:rPr>
+          <w:rFonts w:ascii="新細明體" w:eastAsia="新細明體" w:hAnsi="新細明體" w:cs="新細明體"/>
+          <w:kern w:val="0"/>
+          <w:szCs w:val="24"/>
+        </w:rPr>
+        <w:t>界作業順利進行</w:t>
+      </w:r>
+      <w:r>
+        <w:rPr>
+          <w:rFonts w:ascii="新細明體" w:eastAsia="新細明體" w:hAnsi="新細明體" w:cs="新細明體" w:hint="eastAsia"/>
+          <w:kern w:val="0"/>
+          <w:szCs w:val="24"/>
+        </w:rPr>
+        <w:t>並</w:t>
+      </w:r>
+      <w:r>
+        <w:rPr>
+          <w:rFonts w:ascii="新細明體" w:eastAsia="新細明體" w:hAnsi="新細明體" w:cs="新細明體"/>
+          <w:kern w:val="0"/>
+          <w:szCs w:val="24"/>
+        </w:rPr>
+        <w:t>保障</w:t>
+      </w:r>
+      <w:r>
+        <w:rPr>
+          <w:rFonts w:ascii="新細明體" w:eastAsia="新細明體" w:hAnsi="新細明體" w:cs="新細明體" w:hint="eastAsia"/>
+          <w:kern w:val="0"/>
+          <w:szCs w:val="24"/>
+        </w:rPr>
+        <w:t>申請人</w:t>
+      </w:r>
+      <w:r>
+        <w:rPr>
+          <w:rFonts w:ascii="新細明體" w:eastAsia="新細明體" w:hAnsi="新細明體" w:cs="新細明體"/>
+          <w:kern w:val="0"/>
+          <w:szCs w:val="24"/>
+        </w:rPr>
+        <w:t>權益，請留意以下：</w:t>
+      </w:r>
+    </w:p>
+    <w:p>
+      <w:pPr>
+        <w:widowControl/>
+        <w:spacing w:before="100" w:beforeAutospacing="1" w:after="100" w:afterAutospacing="1"/>
+        <w:rPr>
+          <w:rFonts w:ascii="新細明體" w:eastAsia="新細明體" w:hAnsi="新細明體" w:cs="新細明體"/>
+          <w:kern w:val="0"/>
+          <w:szCs w:val="24"/>
+        </w:rPr>
+      </w:pPr>
+      <w:r>
+        <w:rPr>
+          <w:rFonts w:ascii="新細明體" w:eastAsia="新細明體" w:hAnsi="新細明體" w:cs="新細明體"/>
+          <w:kern w:val="0"/>
+          <w:szCs w:val="24"/>
+        </w:rPr>
+        <w:t>一、清除障礙物：請於排定測量日前，預先清除現場可能阻礙測量</w:t>
+      </w:r>
+      <w:proofErr w:type="gramStart"/>
+      <w:r>
+        <w:rPr>
+          <w:rFonts w:ascii="新細明體" w:eastAsia="新細明體" w:hAnsi="新細明體" w:cs="新細明體"/>
+          <w:kern w:val="0"/>
+          <w:szCs w:val="24"/>
+        </w:rPr>
+        <w:t>視線或動線</w:t>
+      </w:r>
+      <w:proofErr w:type="gramEnd"/>
+      <w:r>
+        <w:rPr>
+          <w:rFonts w:ascii="新細明體" w:eastAsia="新細明體" w:hAnsi="新細明體" w:cs="新細明體"/>
+          <w:kern w:val="0"/>
+          <w:szCs w:val="24"/>
+        </w:rPr>
+        <w:t>之障礙物。若測量員到場時因障礙物致無法實施測量，將依規定開立補正通知書；申請人須於接到通知書之日起十五日內補正完畢，逾期未補正將依法予以駁回。</w:t>
+      </w:r>
+    </w:p>
+    <w:p>
+      <w:pPr>
+        <w:widowControl/>
+        <w:spacing w:before="100" w:beforeAutospacing="1" w:after="100" w:afterAutospacing="1"/>
+        <w:rPr>
+          <w:rFonts w:ascii="新細明體" w:eastAsia="新細明體" w:hAnsi="新細明體" w:cs="新細明體"/>
+          <w:kern w:val="0"/>
+          <w:szCs w:val="24"/>
+        </w:rPr>
+      </w:pPr>
+      <w:r>
+        <w:rPr>
+          <w:rFonts w:ascii="新細明體" w:eastAsia="新細明體" w:hAnsi="新細明體" w:cs="新細明體"/>
+          <w:kern w:val="0"/>
+          <w:szCs w:val="24"/>
+        </w:rPr>
+        <w:t>二、核對身分：</w:t>
+      </w:r>
+      <w:proofErr w:type="gramStart"/>
+      <w:r>
+        <w:rPr>
+          <w:rFonts w:ascii="新細明體" w:eastAsia="新細明體" w:hAnsi="新細明體" w:cs="新細明體"/>
+          <w:kern w:val="0"/>
+          <w:szCs w:val="24"/>
+        </w:rPr>
+        <w:t>鑑</w:t>
+      </w:r>
+      <w:proofErr w:type="gramEnd"/>
+      <w:r>
+        <w:rPr>
+          <w:rFonts w:ascii="新細明體" w:eastAsia="新細明體" w:hAnsi="新細明體" w:cs="新細明體"/>
+          <w:kern w:val="0"/>
+          <w:szCs w:val="24"/>
+        </w:rPr>
+        <w:t>界當天，請原申請人或所有權人本人親自到場，並攜帶「身分證明文件正本」，以供測量員核對身分。</w:t>
+      </w:r>
+    </w:p>
+    <w:p>
+      <w:pPr>
+        <w:widowControl/>
+        <w:spacing w:before="100" w:beforeAutospacing="1" w:after="100" w:afterAutospacing="1"/>
+        <w:rPr>
+          <w:rFonts w:ascii="新細明體" w:eastAsia="新細明體" w:hAnsi="新細明體" w:cs="新細明體"/>
+          <w:kern w:val="0"/>
+          <w:szCs w:val="24"/>
+        </w:rPr>
+      </w:pPr>
+      <w:r>
+        <w:rPr>
+          <w:rFonts w:ascii="新細明體" w:eastAsia="新細明體" w:hAnsi="新細明體" w:cs="新細明體"/>
+          <w:kern w:val="0"/>
+          <w:szCs w:val="24"/>
+        </w:rPr>
+        <w:t>三、委託代理：若本人無法親自到場，委由代理人出席時，請代理人務必攜帶「代理人身分證正本」及「委託書」。</w:t>
+      </w:r>
+    </w:p>
+    <w:p>
+      <w:pPr>
+        <w:widowControl/>
+        <w:spacing w:before="100" w:beforeAutospacing="1" w:after="100" w:afterAutospacing="1"/>
+        <w:rPr>
+          <w:rFonts w:ascii="新細明體" w:eastAsia="新細明體" w:hAnsi="新細明體" w:cs="新細明體"/>
+          <w:kern w:val="0"/>
+          <w:szCs w:val="24"/>
+        </w:rPr>
+      </w:pPr>
+      <w:r>
+        <w:rPr>
+          <w:rFonts w:ascii="新細明體" w:eastAsia="新細明體" w:hAnsi="新細明體" w:cs="新細明體"/>
+          <w:kern w:val="0"/>
+          <w:szCs w:val="24"/>
+        </w:rPr>
+        <w:t>四、準備工具與埋設界標：本所測量員會於現場提供制式界標（包含界樁及鋼釘），惟</w:t>
+      </w:r>
+      <w:r>
+        <w:rPr>
+          <w:rFonts w:ascii="新細明體" w:eastAsia="新細明體" w:hAnsi="新細明體" w:cs="新細明體" w:hint="eastAsia"/>
+          <w:kern w:val="0"/>
+          <w:szCs w:val="24"/>
+        </w:rPr>
+        <w:t>仍</w:t>
+      </w:r>
+      <w:r>
+        <w:rPr>
+          <w:rFonts w:ascii="新細明體" w:eastAsia="新細明體" w:hAnsi="新細明體" w:cs="新細明體"/>
+          <w:kern w:val="0"/>
+          <w:szCs w:val="24"/>
+        </w:rPr>
+        <w:t>請申請人自行準備鐵鎚或噴漆等工具，以便於確認界址後，由申請人自行將制式界</w:t>
+      </w:r>
+      <w:proofErr w:type="gramStart"/>
+      <w:r>
+        <w:rPr>
+          <w:rFonts w:ascii="新細明體" w:eastAsia="新細明體" w:hAnsi="新細明體" w:cs="新細明體"/>
+          <w:kern w:val="0"/>
+          <w:szCs w:val="24"/>
+        </w:rPr>
+        <w:t>標釘立</w:t>
+      </w:r>
+      <w:proofErr w:type="gramEnd"/>
+      <w:r>
+        <w:rPr>
+          <w:rFonts w:ascii="新細明體" w:eastAsia="新細明體" w:hAnsi="新細明體" w:cs="新細明體"/>
+          <w:kern w:val="0"/>
+          <w:szCs w:val="24"/>
+        </w:rPr>
+        <w:t>埋設。</w:t>
+      </w:r>
+    </w:p>
+    <w:p>
+      <w:pPr>
+        <w:widowControl/>
+        <w:spacing w:before="100" w:beforeAutospacing="1" w:after="100" w:afterAutospacing="1"/>
+        <w:rPr>
+          <w:rFonts w:ascii="新細明體" w:eastAsia="新細明體" w:hAnsi="新細明體" w:cs="新細明體"/>
+          <w:kern w:val="0"/>
+          <w:szCs w:val="24"/>
+        </w:rPr>
+      </w:pPr>
+      <w:r>
+        <w:rPr>
+          <w:rFonts w:ascii="Microsoft JhengHei UI" w:eastAsia="Microsoft JhengHei UI" w:hAnsi="Microsoft JhengHei UI" w:cs="新細明體" w:hint="eastAsia"/>
+          <w:b/>
+          <w:bCs/>
+          <w:color w:val="367F98"/>
+          <w:kern w:val="0"/>
+          <w:sz w:val="41"/>
+          <w:szCs w:val="41"/>
+          <w:u w:val="single"/>
+        </w:rPr>
+        <w:lastRenderedPageBreak/>
+        <w:t>12.</w:t>
+      </w:r>
+      <w:r>
+        <w:rPr>
+          <w:rFonts w:ascii="Microsoft JhengHei UI" w:eastAsia="Microsoft JhengHei UI" w:hAnsi="Microsoft JhengHei UI" w:cs="新細明體" w:hint="eastAsia"/>
+          <w:b/>
+          <w:bCs/>
+          <w:color w:val="367F98"/>
+          <w:kern w:val="0"/>
+          <w:sz w:val="41"/>
+          <w:szCs w:val="41"/>
+          <w:u w:val="single"/>
+        </w:rPr>
+        <w:t>下雨天會照常進行測量嗎？</w:t>
+      </w:r>
+    </w:p>
+    <w:p>
+      <w:pPr>
+        <w:widowControl/>
+        <w:spacing w:before="100" w:beforeAutospacing="1" w:after="100" w:afterAutospacing="1"/>
+        <w:rPr>
+          <w:rFonts w:ascii="新細明體" w:eastAsia="新細明體" w:hAnsi="新細明體" w:cs="新細明體"/>
+          <w:kern w:val="0"/>
+          <w:szCs w:val="24"/>
+        </w:rPr>
+      </w:pPr>
+      <w:r>
+        <w:rPr>
+          <w:rFonts w:ascii="新細明體" w:eastAsia="新細明體" w:hAnsi="新細明體" w:cs="新細明體"/>
+          <w:kern w:val="0"/>
+          <w:szCs w:val="24"/>
+        </w:rPr>
+        <w:t>A：若遇雨天或其他氣候因素，將由測量員依據現場天候狀況評估是否實施</w:t>
+      </w:r>
+      <w:proofErr w:type="gramStart"/>
+      <w:r>
+        <w:rPr>
+          <w:rFonts w:ascii="新細明體" w:eastAsia="新細明體" w:hAnsi="新細明體" w:cs="新細明體"/>
+          <w:kern w:val="0"/>
+          <w:szCs w:val="24"/>
         </w:rPr>
         <w:t>複</w:t>
       </w:r>
       <w:proofErr w:type="gramEnd"/>
       <w:r>
         <w:rPr>
-          <w:rFonts w:ascii="Verdana" w:eastAsia="Microsoft JhengHei UI" w:hAnsi="Verdana" w:cs="新細明體" w:hint="eastAsia"/>
-          <w:color w:val="555555"/>
-          <w:kern w:val="0"/>
-          <w:sz w:val="28"/>
-          <w:szCs w:val="28"/>
-        </w:rPr>
-        <w:t>丈申請書後，另行安排時間測量。</w:t>
-      </w:r>
-    </w:p>
-    <w:p/>
+          <w:rFonts w:ascii="新細明體" w:eastAsia="新細明體" w:hAnsi="新細明體" w:cs="新細明體"/>
+          <w:kern w:val="0"/>
+          <w:szCs w:val="24"/>
+        </w:rPr>
+        <w:t>丈。詳細說明如下：</w:t>
+      </w:r>
+    </w:p>
+    <w:p>
+      <w:pPr>
+        <w:widowControl/>
+        <w:spacing w:before="100" w:beforeAutospacing="1" w:after="100" w:afterAutospacing="1"/>
+        <w:rPr>
+          <w:rFonts w:ascii="新細明體" w:eastAsia="新細明體" w:hAnsi="新細明體" w:cs="新細明體"/>
+          <w:kern w:val="0"/>
+          <w:szCs w:val="24"/>
+        </w:rPr>
+      </w:pPr>
+      <w:r>
+        <w:rPr>
+          <w:rFonts w:ascii="新細明體" w:eastAsia="新細明體" w:hAnsi="新細明體" w:cs="新細明體"/>
+          <w:kern w:val="0"/>
+          <w:szCs w:val="24"/>
+        </w:rPr>
+        <w:t>一、當日主動洽詢：因天氣變化難以精</w:t>
+      </w:r>
+      <w:proofErr w:type="gramStart"/>
+      <w:r>
+        <w:rPr>
+          <w:rFonts w:ascii="新細明體" w:eastAsia="新細明體" w:hAnsi="新細明體" w:cs="新細明體"/>
+          <w:kern w:val="0"/>
+          <w:szCs w:val="24"/>
+        </w:rPr>
+        <w:t>準</w:t>
+      </w:r>
+      <w:proofErr w:type="gramEnd"/>
+      <w:r>
+        <w:rPr>
+          <w:rFonts w:ascii="新細明體" w:eastAsia="新細明體" w:hAnsi="新細明體" w:cs="新細明體"/>
+          <w:kern w:val="0"/>
+          <w:szCs w:val="24"/>
+        </w:rPr>
+        <w:t>預測，建議申請人</w:t>
+      </w:r>
+      <w:r>
+        <w:rPr>
+          <w:rFonts w:ascii="新細明體" w:eastAsia="新細明體" w:hAnsi="新細明體" w:cs="新細明體" w:hint="eastAsia"/>
+          <w:kern w:val="0"/>
+          <w:szCs w:val="24"/>
+        </w:rPr>
+        <w:t>(鄰地關係人)</w:t>
+      </w:r>
+      <w:r>
+        <w:rPr>
+          <w:rFonts w:ascii="新細明體" w:eastAsia="新細明體" w:hAnsi="新細明體" w:cs="新細明體"/>
+          <w:kern w:val="0"/>
+          <w:szCs w:val="24"/>
+        </w:rPr>
+        <w:t>於</w:t>
+      </w:r>
+      <w:proofErr w:type="gramStart"/>
+      <w:r>
+        <w:rPr>
+          <w:rFonts w:ascii="新細明體" w:eastAsia="新細明體" w:hAnsi="新細明體" w:cs="新細明體"/>
+          <w:kern w:val="0"/>
+          <w:szCs w:val="24"/>
+        </w:rPr>
+        <w:t>鑑</w:t>
+      </w:r>
+      <w:proofErr w:type="gramEnd"/>
+      <w:r>
+        <w:rPr>
+          <w:rFonts w:ascii="新細明體" w:eastAsia="新細明體" w:hAnsi="新細明體" w:cs="新細明體"/>
+          <w:kern w:val="0"/>
+          <w:szCs w:val="24"/>
+        </w:rPr>
+        <w:t>界當天</w:t>
+      </w:r>
+      <w:r>
+        <w:rPr>
+          <w:rFonts w:ascii="新細明體" w:eastAsia="新細明體" w:hAnsi="新細明體" w:cs="新細明體" w:hint="eastAsia"/>
+          <w:kern w:val="0"/>
+          <w:szCs w:val="24"/>
+        </w:rPr>
+        <w:t>一早</w:t>
+      </w:r>
+      <w:r>
+        <w:rPr>
+          <w:rFonts w:ascii="新細明體" w:eastAsia="新細明體" w:hAnsi="新細明體" w:cs="新細明體"/>
+          <w:kern w:val="0"/>
+          <w:szCs w:val="24"/>
+        </w:rPr>
+        <w:t>先行致電本所洽詢該案測量員，確認當日是否如期進行測量作業。</w:t>
+      </w:r>
+    </w:p>
+    <w:p>
+      <w:pPr>
+        <w:widowControl/>
+        <w:spacing w:before="100" w:beforeAutospacing="1" w:after="100" w:afterAutospacing="1"/>
+        <w:rPr>
+          <w:rFonts w:ascii="新細明體" w:eastAsia="新細明體" w:hAnsi="新細明體" w:cs="新細明體"/>
+          <w:kern w:val="0"/>
+          <w:szCs w:val="24"/>
+        </w:rPr>
+      </w:pPr>
+      <w:r>
+        <w:rPr>
+          <w:rFonts w:ascii="新細明體" w:eastAsia="新細明體" w:hAnsi="新細明體" w:cs="新細明體"/>
+          <w:kern w:val="0"/>
+          <w:szCs w:val="24"/>
+        </w:rPr>
+        <w:t>二、測量作業評估：下雨天除實地作業困難外，亦會影響儀器觀測之測量精度，且易造成精密設備損壞。為確保測量品質與成果正確性，若雨勢過大致無法實施測量，測量員將決定暫緩作業。</w:t>
+      </w:r>
+    </w:p>
+    <w:p>
+      <w:pPr>
+        <w:widowControl/>
+        <w:spacing w:before="100" w:beforeAutospacing="1" w:after="100" w:afterAutospacing="1"/>
+        <w:rPr>
+          <w:rFonts w:ascii="新細明體" w:eastAsia="新細明體" w:hAnsi="新細明體" w:cs="新細明體"/>
+          <w:kern w:val="0"/>
+          <w:szCs w:val="24"/>
+        </w:rPr>
+      </w:pPr>
+      <w:r>
+        <w:rPr>
+          <w:rFonts w:ascii="新細明體" w:eastAsia="新細明體" w:hAnsi="新細明體" w:cs="新細明體"/>
+          <w:kern w:val="0"/>
+          <w:szCs w:val="24"/>
+        </w:rPr>
+        <w:t>三、改期與書面通知：若因風雨或其他事故致當日不能實施</w:t>
+      </w:r>
+      <w:proofErr w:type="gramStart"/>
+      <w:r>
+        <w:rPr>
+          <w:rFonts w:ascii="新細明體" w:eastAsia="新細明體" w:hAnsi="新細明體" w:cs="新細明體"/>
+          <w:kern w:val="0"/>
+          <w:szCs w:val="24"/>
+        </w:rPr>
+        <w:t>複</w:t>
+      </w:r>
+      <w:proofErr w:type="gramEnd"/>
+      <w:r>
+        <w:rPr>
+          <w:rFonts w:ascii="新細明體" w:eastAsia="新細明體" w:hAnsi="新細明體" w:cs="新細明體"/>
+          <w:kern w:val="0"/>
+          <w:szCs w:val="24"/>
+        </w:rPr>
+        <w:t>丈，本所將依規定辦理改期。考量</w:t>
+      </w:r>
+      <w:r>
+        <w:rPr>
+          <w:rFonts w:ascii="新細明體" w:eastAsia="新細明體" w:hAnsi="新細明體" w:cs="新細明體" w:hint="eastAsia"/>
+          <w:kern w:val="0"/>
+          <w:szCs w:val="24"/>
+        </w:rPr>
+        <w:t>地所未</w:t>
+      </w:r>
+      <w:proofErr w:type="gramStart"/>
+      <w:r>
+        <w:rPr>
+          <w:rFonts w:ascii="新細明體" w:eastAsia="新細明體" w:hAnsi="新細明體" w:cs="新細明體" w:hint="eastAsia"/>
+          <w:kern w:val="0"/>
+          <w:szCs w:val="24"/>
+        </w:rPr>
+        <w:t>留存</w:t>
+      </w:r>
+      <w:r>
+        <w:rPr>
+          <w:rFonts w:ascii="新細明體" w:eastAsia="新細明體" w:hAnsi="新細明體" w:cs="新細明體"/>
+          <w:kern w:val="0"/>
+          <w:szCs w:val="24"/>
+        </w:rPr>
+        <w:t>無鄰地</w:t>
+      </w:r>
+      <w:proofErr w:type="gramEnd"/>
+      <w:r>
+        <w:rPr>
+          <w:rFonts w:ascii="新細明體" w:eastAsia="新細明體" w:hAnsi="新細明體" w:cs="新細明體"/>
+          <w:kern w:val="0"/>
+          <w:szCs w:val="24"/>
+        </w:rPr>
+        <w:t>關係人之聯絡電話，致無法即時以電話聯繫，後續將一律以「書面通知」申請人及關係人改期</w:t>
+      </w:r>
+      <w:proofErr w:type="gramStart"/>
+      <w:r>
+        <w:rPr>
+          <w:rFonts w:ascii="新細明體" w:eastAsia="新細明體" w:hAnsi="新細明體" w:cs="新細明體"/>
+          <w:kern w:val="0"/>
+          <w:szCs w:val="24"/>
+        </w:rPr>
+        <w:t>複</w:t>
+      </w:r>
+      <w:proofErr w:type="gramEnd"/>
+      <w:r>
+        <w:rPr>
+          <w:rFonts w:ascii="新細明體" w:eastAsia="新細明體" w:hAnsi="新細明體" w:cs="新細明體"/>
+          <w:kern w:val="0"/>
+          <w:szCs w:val="24"/>
+        </w:rPr>
+        <w:t>丈之時間，尚</w:t>
+      </w:r>
+      <w:proofErr w:type="gramStart"/>
+      <w:r>
+        <w:rPr>
+          <w:rFonts w:ascii="新細明體" w:eastAsia="新細明體" w:hAnsi="新細明體" w:cs="新細明體"/>
+          <w:kern w:val="0"/>
+          <w:szCs w:val="24"/>
+        </w:rPr>
+        <w:t>祈</w:t>
+      </w:r>
+      <w:proofErr w:type="gramEnd"/>
+      <w:r>
+        <w:rPr>
+          <w:rFonts w:ascii="新細明體" w:eastAsia="新細明體" w:hAnsi="新細明體" w:cs="新細明體"/>
+          <w:kern w:val="0"/>
+          <w:szCs w:val="24"/>
+        </w:rPr>
+        <w:t>見諒。</w:t>
+      </w:r>
+    </w:p>
+    <w:p>
+      <w:pPr>
+        <w:rPr>
+          <w:rFonts w:hint="eastAsia"/>
+          <w:color w:val="5B9BD5" w:themeColor="accent1"/>
+          <w:sz w:val="44"/>
+        </w:rPr>
+      </w:pPr>
+      <w:bookmarkStart w:id="0" w:name="_GoBack"/>
+      <w:r>
+        <w:rPr>
+          <w:rFonts w:hint="eastAsia"/>
+          <w:color w:val="5B9BD5" w:themeColor="accent1"/>
+          <w:sz w:val="44"/>
+        </w:rPr>
+        <w:t>13</w:t>
+      </w:r>
+      <w:r>
+        <w:rPr>
+          <w:rFonts w:hint="eastAsia"/>
+          <w:color w:val="5B9BD5" w:themeColor="accent1"/>
+          <w:sz w:val="44"/>
+        </w:rPr>
+        <w:t>土地</w:t>
+      </w:r>
+      <w:proofErr w:type="gramStart"/>
+      <w:r>
+        <w:rPr>
+          <w:rFonts w:hint="eastAsia"/>
+          <w:color w:val="5B9BD5" w:themeColor="accent1"/>
+          <w:sz w:val="44"/>
+        </w:rPr>
+        <w:t>鑑</w:t>
+      </w:r>
+      <w:proofErr w:type="gramEnd"/>
+      <w:r>
+        <w:rPr>
+          <w:rFonts w:hint="eastAsia"/>
+          <w:color w:val="5B9BD5" w:themeColor="accent1"/>
+          <w:sz w:val="44"/>
+        </w:rPr>
+        <w:t>界申請人資格</w:t>
+      </w:r>
+      <w:proofErr w:type="gramStart"/>
+      <w:r>
+        <w:rPr>
+          <w:rFonts w:hint="eastAsia"/>
+          <w:color w:val="5B9BD5" w:themeColor="accent1"/>
+          <w:sz w:val="44"/>
+        </w:rPr>
+        <w:t>﹕</w:t>
+      </w:r>
+      <w:proofErr w:type="gramEnd"/>
+    </w:p>
+    <w:bookmarkEnd w:id="0"/>
+    <w:p>
+      <w:pPr>
+        <w:rPr>
+          <w:rFonts w:hint="eastAsia"/>
+        </w:rPr>
+      </w:pPr>
+      <w:proofErr w:type="gramStart"/>
+      <w:r>
+        <w:rPr>
+          <w:rFonts w:hint="eastAsia"/>
+        </w:rPr>
+        <w:t>一﹑</w:t>
+      </w:r>
+      <w:proofErr w:type="gramEnd"/>
+      <w:r>
+        <w:rPr>
+          <w:rFonts w:hint="eastAsia"/>
+        </w:rPr>
+        <w:t>凡土地經界不明者</w:t>
+      </w:r>
+      <w:proofErr w:type="gramStart"/>
+      <w:r>
+        <w:rPr>
+          <w:rFonts w:hint="eastAsia"/>
+        </w:rPr>
+        <w:t>﹐</w:t>
+      </w:r>
+      <w:proofErr w:type="gramEnd"/>
+      <w:r>
+        <w:rPr>
+          <w:rFonts w:hint="eastAsia"/>
+        </w:rPr>
+        <w:t>由土地所有權人或管理人申請之。</w:t>
+      </w:r>
+    </w:p>
+    <w:p>
+      <w:pPr>
+        <w:rPr>
+          <w:rFonts w:hint="eastAsia"/>
+        </w:rPr>
+      </w:pPr>
+      <w:r>
+        <w:rPr>
+          <w:rFonts w:hint="eastAsia"/>
+        </w:rPr>
+        <w:t>二</w:t>
+      </w:r>
+      <w:proofErr w:type="gramStart"/>
+      <w:r>
+        <w:rPr>
+          <w:rFonts w:hint="eastAsia"/>
+        </w:rPr>
+        <w:t>﹑</w:t>
+      </w:r>
+      <w:proofErr w:type="gramEnd"/>
+      <w:r>
+        <w:rPr>
+          <w:rFonts w:hint="eastAsia"/>
+        </w:rPr>
+        <w:t>因承租土地經界不明者</w:t>
+      </w:r>
+      <w:proofErr w:type="gramStart"/>
+      <w:r>
+        <w:rPr>
+          <w:rFonts w:hint="eastAsia"/>
+        </w:rPr>
+        <w:t>﹐</w:t>
+      </w:r>
+      <w:proofErr w:type="gramEnd"/>
+      <w:r>
+        <w:rPr>
+          <w:rFonts w:hint="eastAsia"/>
+        </w:rPr>
+        <w:t>應由承租人會同土地所有權人或管理人申請。</w:t>
+      </w:r>
+    </w:p>
+    <w:p>
+      <w:pPr>
+        <w:rPr>
+          <w:rFonts w:hint="eastAsia"/>
+        </w:rPr>
+      </w:pPr>
+      <w:r>
+        <w:rPr>
+          <w:rFonts w:hint="eastAsia"/>
+        </w:rPr>
+        <w:t>三</w:t>
+      </w:r>
+      <w:proofErr w:type="gramStart"/>
+      <w:r>
+        <w:rPr>
+          <w:rFonts w:hint="eastAsia"/>
+        </w:rPr>
+        <w:t>﹑</w:t>
+      </w:r>
+      <w:proofErr w:type="gramEnd"/>
+      <w:r>
+        <w:rPr>
+          <w:rFonts w:hint="eastAsia"/>
+        </w:rPr>
+        <w:t>共有土地得由部分共有人單獨申請之。</w:t>
+      </w:r>
+    </w:p>
+    <w:p>
+      <w:pPr>
+        <w:rPr>
+          <w:rFonts w:hint="eastAsia"/>
+        </w:rPr>
+      </w:pPr>
+      <w:r>
+        <w:rPr>
+          <w:rFonts w:hint="eastAsia"/>
+        </w:rPr>
+        <w:t>四</w:t>
+      </w:r>
+      <w:proofErr w:type="gramStart"/>
+      <w:r>
+        <w:rPr>
+          <w:rFonts w:hint="eastAsia"/>
+        </w:rPr>
+        <w:t>﹑</w:t>
+      </w:r>
+      <w:proofErr w:type="gramEnd"/>
+      <w:r>
+        <w:rPr>
+          <w:rFonts w:hint="eastAsia"/>
+        </w:rPr>
+        <w:t>公有土地同意他人建築使用</w:t>
+      </w:r>
+      <w:proofErr w:type="gramStart"/>
+      <w:r>
+        <w:rPr>
+          <w:rFonts w:hint="eastAsia"/>
+        </w:rPr>
+        <w:t>﹐</w:t>
+      </w:r>
+      <w:proofErr w:type="gramEnd"/>
+      <w:r>
+        <w:rPr>
+          <w:rFonts w:hint="eastAsia"/>
+        </w:rPr>
+        <w:t>如能檢具確實證明文件</w:t>
+      </w:r>
+      <w:proofErr w:type="gramStart"/>
+      <w:r>
+        <w:rPr>
+          <w:rFonts w:hint="eastAsia"/>
+        </w:rPr>
+        <w:t>﹐</w:t>
+      </w:r>
+      <w:proofErr w:type="gramEnd"/>
+      <w:r>
+        <w:rPr>
+          <w:rFonts w:hint="eastAsia"/>
+        </w:rPr>
+        <w:t>得由使用人代位申請辦理。</w:t>
+      </w:r>
+    </w:p>
+    <w:p>
+      <w:r>
+        <w:rPr>
+          <w:rFonts w:hint="eastAsia"/>
+        </w:rPr>
+        <w:t>五</w:t>
+      </w:r>
+      <w:proofErr w:type="gramStart"/>
+      <w:r>
+        <w:rPr>
+          <w:rFonts w:hint="eastAsia"/>
+        </w:rPr>
+        <w:t>﹑</w:t>
+      </w:r>
+      <w:proofErr w:type="gramEnd"/>
+      <w:r>
+        <w:rPr>
+          <w:rFonts w:hint="eastAsia"/>
+        </w:rPr>
+        <w:t>繼承人檢具被繼承人</w:t>
+      </w:r>
+      <w:r>
+        <w:rPr>
+          <w:rFonts w:hint="eastAsia"/>
+        </w:rPr>
+        <w:t>(</w:t>
+      </w:r>
+      <w:r>
+        <w:rPr>
+          <w:rFonts w:hint="eastAsia"/>
+        </w:rPr>
+        <w:t>原土地所有權人</w:t>
+      </w:r>
+      <w:r>
+        <w:rPr>
+          <w:rFonts w:hint="eastAsia"/>
+        </w:rPr>
+        <w:t>)</w:t>
+      </w:r>
+      <w:r>
+        <w:rPr>
+          <w:rFonts w:hint="eastAsia"/>
+        </w:rPr>
+        <w:t>死亡後戶籍謄本</w:t>
+      </w:r>
+      <w:r>
+        <w:rPr>
+          <w:rFonts w:hint="eastAsia"/>
+        </w:rPr>
+        <w:t>(</w:t>
+      </w:r>
+      <w:r>
+        <w:rPr>
+          <w:rFonts w:hint="eastAsia"/>
+        </w:rPr>
+        <w:t>除戶證明</w:t>
+      </w:r>
+      <w:r>
+        <w:rPr>
+          <w:rFonts w:hint="eastAsia"/>
+        </w:rPr>
+        <w:t>)</w:t>
+      </w:r>
+      <w:proofErr w:type="gramStart"/>
+      <w:r>
+        <w:rPr>
+          <w:rFonts w:hint="eastAsia"/>
+        </w:rPr>
+        <w:t>﹐</w:t>
+      </w:r>
+      <w:proofErr w:type="gramEnd"/>
+      <w:r>
+        <w:rPr>
+          <w:rFonts w:hint="eastAsia"/>
+        </w:rPr>
+        <w:t>得以證明其繼承人之身份</w:t>
+      </w:r>
+      <w:proofErr w:type="gramStart"/>
+      <w:r>
+        <w:rPr>
+          <w:rFonts w:hint="eastAsia"/>
+        </w:rPr>
+        <w:t>﹐</w:t>
+      </w:r>
+      <w:proofErr w:type="gramEnd"/>
+      <w:r>
+        <w:rPr>
+          <w:rFonts w:hint="eastAsia"/>
+        </w:rPr>
+        <w:t>並於土地</w:t>
+      </w:r>
+      <w:proofErr w:type="gramStart"/>
+      <w:r>
+        <w:rPr>
+          <w:rFonts w:hint="eastAsia"/>
+        </w:rPr>
+        <w:t>複</w:t>
+      </w:r>
+      <w:proofErr w:type="gramEnd"/>
+      <w:r>
+        <w:rPr>
+          <w:rFonts w:hint="eastAsia"/>
+        </w:rPr>
+        <w:t>丈申請書備註欄加</w:t>
+      </w:r>
+      <w:proofErr w:type="gramStart"/>
+      <w:r>
+        <w:rPr>
+          <w:rFonts w:hint="eastAsia"/>
+        </w:rPr>
+        <w:t>註</w:t>
+      </w:r>
+      <w:proofErr w:type="gramEnd"/>
+      <w:r>
+        <w:rPr>
+          <w:rFonts w:hint="eastAsia"/>
+        </w:rPr>
+        <w:t>無拋棄繼承權情事者</w:t>
+      </w:r>
+      <w:proofErr w:type="gramStart"/>
+      <w:r>
+        <w:rPr>
+          <w:rFonts w:hint="eastAsia"/>
+        </w:rPr>
+        <w:t>﹐</w:t>
+      </w:r>
+      <w:proofErr w:type="gramEnd"/>
+      <w:r>
+        <w:rPr>
+          <w:rFonts w:hint="eastAsia"/>
+        </w:rPr>
+        <w:t>得由繼承人代位申請辦理。</w:t>
+      </w:r>
+    </w:p>
     <w:sectPr>
       <w:pgSz w:w="11906" w:h="16838"/>
       <w:pgMar w:top="1440" w:right="1800" w:bottom="1440" w:left="1800" w:header="851" w:footer="992" w:gutter="0"/>

</xml_diff>